<commit_message>
feat: convert doctor provisioning into in-page dialog with local avatar upload from device
</commit_message>
<xml_diff>
--- a/medical-appointment/docs/BAO_CAO_TIEN_DO_DU_AN.docx
+++ b/medical-appointment/docs/BAO_CAO_TIEN_DO_DU_AN.docx
@@ -718,7 +718,7 @@
               <w:rPr>
                 <w:sz w:val="17"/>
               </w:rPr>
-              <w:t>Khung giao diện chuẩn Slate-900 / Blue-600; Sidebar thu gọn thông minh; Nút chuyển nhanh sang Cổng Bác sĩ và Website người dùng; Có mục menu riêng 'Cấp tài khoản Bác sĩ'.</w:t>
+              <w:t>Khung giao diện chuẩn Slate-900 / Blue-600; Sidebar thu gọn thông minh; Nút chuyển nhanh sang Cổng Bác sĩ và Website người dùng; Menu điều hướng tinh gọn 4 phân hệ cốt lõi.</w:t>
             </w:r>
           </w:p>
         </w:tc>
@@ -830,7 +830,7 @@
               <w:rPr>
                 <w:sz w:val="17"/>
               </w:rPr>
-              <w:t>KPI Cards: Tổng bác sĩ, chuyên khoa, số ca khám, bệnh nhân, doanh thu. Thanh phân bổ tỷ lệ ca khám (Chờ duyệt, Đã khám, Đã hủy). Nút lối tắt cấp tài khoản và danh sách bác sĩ.</w:t>
+              <w:t>KPI Cards: Tổng bác sĩ, chuyên khoa, số ca khám, bệnh nhân, doanh thu. Thanh phân bổ tỷ lệ ca khám (Chờ duyệt, Đã khám, Đã hủy). Nút lối tắt cấp tài khoản (kích hoạt mở Dialog) và danh sách bác sĩ.</w:t>
             </w:r>
           </w:p>
         </w:tc>
@@ -888,7 +888,7 @@
                 <w:b/>
                 <w:sz w:val="17"/>
               </w:rPr>
-              <w:t>AdminCreateDoctor.jsx</w:t>
+              <w:t>AdminDoctors.jsx</w:t>
             </w:r>
           </w:p>
         </w:tc>
@@ -914,9 +914,9 @@
               <w:rPr>
                 <w:sz w:val="17"/>
               </w:rPr>
-              <w:t>/admin/doctors/create</w:t>
+              <w:t>/admin/doctors</w:t>
               <w:br/>
-              <w:t>/admin/create-doctor</w:t>
+              <w:t>/dashboard/doctor</w:t>
             </w:r>
           </w:p>
         </w:tc>
@@ -942,7 +942,19 @@
               <w:rPr>
                 <w:sz w:val="17"/>
               </w:rPr>
-              <w:t>Giao diện Cấp Tài Khoản Bác Sĩ Toàn Diện: Form 3 phần chuẩn hóa (Tài khoản &amp; Pass khởi tạo, Định danh &amp; Phân khoa động từ DB, Liên hệ &amp; Avatar). Live Preview theo thời gian thực. Hộp thoại bàn giao tài khoản với nút 'Sao chép thông tin gửi Bác sĩ' (1-click copy).</w:t>
+              <w:t>Bảng danh sách bác sĩ &amp; Dialog Cấp tài khoản / Upload ảnh tại chỗ:</w:t>
+              <w:br/>
+              <w:t>• Dialog Cấp Tài Khoản Mới: Mở trực tiếp ngay trong trang, không cần chuyển hướng trang.</w:t>
+              <w:br/>
+              <w:t>• Chọn ảnh từ máy tính / thiết bị: Tải ảnh avatar trực tiếp từ máy tính (&lt;input type='file'&gt;), tự động upload lên server và hiển thị preview tức thì.</w:t>
+              <w:br/>
+              <w:t>• Sinh mật khẩu tự động &amp; Bàn giao: Nút random mật khẩu; Phiếu bàn giao tài khoản với nút 1-click Copy.</w:t>
+              <w:br/>
+              <w:t>• Modal Sửa &amp; Đổi ảnh &amp; Chuyên khoa: Cập nhật thông tin, đổi chuyên khoa và đổi ảnh đại diện từ máy tính.</w:t>
+              <w:br/>
+              <w:t>• Modal Cấp lại mật khẩu: Đổi mật khẩu tài khoản bác sĩ nhanh chóng.</w:t>
+              <w:br/>
+              <w:t>• Xóa Bác sĩ: Hộp thoại an toàn có xử lý ràng buộc lịch hẹn.</w:t>
             </w:r>
           </w:p>
         </w:tc>
@@ -1000,7 +1012,7 @@
                 <w:b/>
                 <w:sz w:val="17"/>
               </w:rPr>
-              <w:t>AdminDoctors.jsx</w:t>
+              <w:t>AdminAppointments.jsx</w:t>
             </w:r>
           </w:p>
         </w:tc>
@@ -1026,9 +1038,7 @@
               <w:rPr>
                 <w:sz w:val="17"/>
               </w:rPr>
-              <w:t>/admin/doctors</w:t>
-              <w:br/>
-              <w:t>/dashboard/doctor</w:t>
+              <w:t>/admin/appointments</w:t>
             </w:r>
           </w:p>
         </w:tc>
@@ -1054,7 +1064,7 @@
               <w:rPr>
                 <w:sz w:val="17"/>
               </w:rPr>
-              <w:t>Bảng danh bạ bác sĩ, tìm kiếm, lọc chuyên khoa. Modal chỉnh sửa thông tin &amp; điều chuyển chuyên khoa. Modal Cấp lại mật khẩu (Reset Password). Nút xóa bác sĩ có kiểm tra an toàn.</w:t>
+              <w:t>Theo dõi và rà soát mọi ca khám bệnh của tất cả các chuyên khoa; Lọc theo trạng thái và tìm kiếm theo tên bệnh nhân / bác sĩ phụ trách.</w:t>
             </w:r>
           </w:p>
         </w:tc>
@@ -1112,7 +1122,7 @@
                 <w:b/>
                 <w:sz w:val="17"/>
               </w:rPr>
-              <w:t>AdminAppointments.jsx</w:t>
+              <w:t>AdminPatients.jsx</w:t>
             </w:r>
           </w:p>
         </w:tc>
@@ -1138,7 +1148,7 @@
               <w:rPr>
                 <w:sz w:val="17"/>
               </w:rPr>
-              <w:t>/admin/appointments</w:t>
+              <w:t>/admin/patients</w:t>
             </w:r>
           </w:p>
         </w:tc>
@@ -1164,7 +1174,7 @@
               <w:rPr>
                 <w:sz w:val="17"/>
               </w:rPr>
-              <w:t>Theo dõi và rà soát mọi ca khám bệnh của tất cả các chuyên khoa; Lọc theo trạng thái và tìm kiếm theo tên bệnh nhân / bác sĩ phụ trách.</w:t>
+              <w:t>Quản lý danh bạ hồ sơ bệnh nhân đã đăng ký trên hệ thống, email, số điện thoại, địa chỉ.</w:t>
             </w:r>
           </w:p>
         </w:tc>
@@ -1222,7 +1232,7 @@
                 <w:b/>
                 <w:sz w:val="17"/>
               </w:rPr>
-              <w:t>AdminPatients.jsx</w:t>
+              <w:t>adminService.js</w:t>
             </w:r>
           </w:p>
         </w:tc>
@@ -1248,7 +1258,7 @@
               <w:rPr>
                 <w:sz w:val="17"/>
               </w:rPr>
-              <w:t>/admin/patients</w:t>
+              <w:t>N/A (API Service)</w:t>
             </w:r>
           </w:p>
         </w:tc>
@@ -1274,117 +1284,7 @@
               <w:rPr>
                 <w:sz w:val="17"/>
               </w:rPr>
-              <w:t>Quản lý danh bạ hồ sơ bệnh nhân đã đăng ký trên hệ thống, email, số điện thoại, địa chỉ.</w:t>
-            </w:r>
-          </w:p>
-        </w:tc>
-      </w:tr>
-      <w:tr>
-        <w:tc>
-          <w:tcPr>
-            <w:tcW w:type="dxa" w:w="720"/>
-            <w:shd w:fill="FFFFFF"/>
-            <w:tcMar>
-              <w:top w:w="70" w:type="dxa"/>
-              <w:bottom w:w="70" w:type="dxa"/>
-              <w:left w:w="80" w:type="dxa"/>
-              <w:right w:w="80" w:type="dxa"/>
-            </w:tcMar>
-            <w:tcBorders>
-              <w:top w:val="single" w:sz="4" w:space="0" w:color="E2E8F0"/>
-              <w:left w:val="single" w:sz="4" w:space="0" w:color="E2E8F0"/>
-              <w:bottom w:val="single" w:sz="4" w:space="0" w:color="E2E8F0"/>
-              <w:right w:val="single" w:sz="4" w:space="0" w:color="E2E8F0"/>
-            </w:tcBorders>
-          </w:tcPr>
-          <w:p>
-            <w:pPr>
-              <w:jc w:val="center"/>
-            </w:pPr>
-            <w:r>
-              <w:rPr>
-                <w:sz w:val="17"/>
-              </w:rPr>
-              <w:t>7</w:t>
-            </w:r>
-          </w:p>
-        </w:tc>
-        <w:tc>
-          <w:tcPr>
-            <w:tcW w:type="dxa" w:w="2592"/>
-            <w:shd w:fill="FFFFFF"/>
-            <w:tcMar>
-              <w:top w:w="70" w:type="dxa"/>
-              <w:bottom w:w="70" w:type="dxa"/>
-              <w:left w:w="80" w:type="dxa"/>
-              <w:right w:w="80" w:type="dxa"/>
-            </w:tcMar>
-            <w:tcBorders>
-              <w:top w:val="single" w:sz="4" w:space="0" w:color="E2E8F0"/>
-              <w:left w:val="single" w:sz="4" w:space="0" w:color="E2E8F0"/>
-              <w:bottom w:val="single" w:sz="4" w:space="0" w:color="E2E8F0"/>
-              <w:right w:val="single" w:sz="4" w:space="0" w:color="E2E8F0"/>
-            </w:tcBorders>
-          </w:tcPr>
-          <w:p>
-            <w:r>
-              <w:rPr>
-                <w:b/>
-                <w:sz w:val="17"/>
-              </w:rPr>
-              <w:t>adminService.js</w:t>
-            </w:r>
-          </w:p>
-        </w:tc>
-        <w:tc>
-          <w:tcPr>
-            <w:tcW w:type="dxa" w:w="2448"/>
-            <w:shd w:fill="FFFFFF"/>
-            <w:tcMar>
-              <w:top w:w="70" w:type="dxa"/>
-              <w:bottom w:w="70" w:type="dxa"/>
-              <w:left w:w="80" w:type="dxa"/>
-              <w:right w:w="80" w:type="dxa"/>
-            </w:tcMar>
-            <w:tcBorders>
-              <w:top w:val="single" w:sz="4" w:space="0" w:color="E2E8F0"/>
-              <w:left w:val="single" w:sz="4" w:space="0" w:color="E2E8F0"/>
-              <w:bottom w:val="single" w:sz="4" w:space="0" w:color="E2E8F0"/>
-              <w:right w:val="single" w:sz="4" w:space="0" w:color="E2E8F0"/>
-            </w:tcBorders>
-          </w:tcPr>
-          <w:p>
-            <w:r>
-              <w:rPr>
-                <w:sz w:val="17"/>
-              </w:rPr>
-              <w:t>N/A (API Service)</w:t>
-            </w:r>
-          </w:p>
-        </w:tc>
-        <w:tc>
-          <w:tcPr>
-            <w:tcW w:type="dxa" w:w="3888"/>
-            <w:shd w:fill="FFFFFF"/>
-            <w:tcMar>
-              <w:top w:w="70" w:type="dxa"/>
-              <w:bottom w:w="70" w:type="dxa"/>
-              <w:left w:w="80" w:type="dxa"/>
-              <w:right w:w="80" w:type="dxa"/>
-            </w:tcMar>
-            <w:tcBorders>
-              <w:top w:val="single" w:sz="4" w:space="0" w:color="E2E8F0"/>
-              <w:left w:val="single" w:sz="4" w:space="0" w:color="E2E8F0"/>
-              <w:bottom w:val="single" w:sz="4" w:space="0" w:color="E2E8F0"/>
-              <w:right w:val="single" w:sz="4" w:space="0" w:color="E2E8F0"/>
-            </w:tcBorders>
-          </w:tcPr>
-          <w:p>
-            <w:r>
-              <w:rPr>
-                <w:sz w:val="17"/>
-              </w:rPr>
-              <w:t>Tầng Axios Service kết nối backend Spring Boot: cấp tài khoản, cập nhật, đổi mật khẩu, xóa bác sĩ, tải danh sách chuyên khoa, tải lịch khám...</w:t>
+              <w:t>Tầng Axios Service kết nối backend Spring Boot: cấp tài khoản, upload avatar từ máy tính, cập nhật, đổi mật khẩu, xóa bác sĩ, tải danh sách chuyên khoa, tải lịch khám...</w:t>
             </w:r>
           </w:p>
         </w:tc>
@@ -1885,7 +1785,7 @@
               <w:rPr>
                 <w:sz w:val="17"/>
               </w:rPr>
-              <w:t>/api/doctor/{id}</w:t>
+              <w:t>/api/upload/image</w:t>
             </w:r>
           </w:p>
         </w:tc>
@@ -1913,10 +1813,236 @@
             <w:r>
               <w:rPr>
                 <w:b/>
+                <w:color w:val="15803D"/>
+                <w:sz w:val="17"/>
+              </w:rPr>
+              <w:t>POST</w:t>
+            </w:r>
+          </w:p>
+        </w:tc>
+        <w:tc>
+          <w:tcPr>
+            <w:tcW w:type="dxa" w:w="2448"/>
+            <w:shd w:fill="F8FAFC"/>
+            <w:tcMar>
+              <w:top w:w="70" w:type="dxa"/>
+              <w:bottom w:w="70" w:type="dxa"/>
+              <w:left w:w="80" w:type="dxa"/>
+              <w:right w:w="80" w:type="dxa"/>
+            </w:tcMar>
+            <w:tcBorders>
+              <w:top w:val="single" w:sz="4" w:space="0" w:color="E2E8F0"/>
+              <w:left w:val="single" w:sz="4" w:space="0" w:color="E2E8F0"/>
+              <w:bottom w:val="single" w:sz="4" w:space="0" w:color="E2E8F0"/>
+              <w:right w:val="single" w:sz="4" w:space="0" w:color="E2E8F0"/>
+            </w:tcBorders>
+          </w:tcPr>
+          <w:p>
+            <w:r>
+              <w:rPr>
+                <w:sz w:val="17"/>
+              </w:rPr>
+              <w:t>UploadController</w:t>
+              <w:br/>
+              <w:t>WebMvcConfig</w:t>
+            </w:r>
+          </w:p>
+        </w:tc>
+        <w:tc>
+          <w:tcPr>
+            <w:tcW w:type="dxa" w:w="2880"/>
+            <w:shd w:fill="F8FAFC"/>
+            <w:tcMar>
+              <w:top w:w="70" w:type="dxa"/>
+              <w:bottom w:w="70" w:type="dxa"/>
+              <w:left w:w="80" w:type="dxa"/>
+              <w:right w:w="80" w:type="dxa"/>
+            </w:tcMar>
+            <w:tcBorders>
+              <w:top w:val="single" w:sz="4" w:space="0" w:color="E2E8F0"/>
+              <w:left w:val="single" w:sz="4" w:space="0" w:color="E2E8F0"/>
+              <w:bottom w:val="single" w:sz="4" w:space="0" w:color="E2E8F0"/>
+              <w:right w:val="single" w:sz="4" w:space="0" w:color="E2E8F0"/>
+            </w:tcBorders>
+          </w:tcPr>
+          <w:p>
+            <w:r>
+              <w:rPr>
+                <w:sz w:val="17"/>
+              </w:rPr>
+              <w:t>Tải ảnh avatar trực tiếp từ máy tính / thiết bị người dùng; lưu vào uploads/ và phục vụ tĩnh trực tiếp qua URL.</w:t>
+            </w:r>
+          </w:p>
+        </w:tc>
+      </w:tr>
+      <w:tr>
+        <w:tc>
+          <w:tcPr>
+            <w:tcW w:type="dxa" w:w="3168"/>
+            <w:shd w:fill="FFFFFF"/>
+            <w:tcMar>
+              <w:top w:w="70" w:type="dxa"/>
+              <w:bottom w:w="70" w:type="dxa"/>
+              <w:left w:w="80" w:type="dxa"/>
+              <w:right w:w="80" w:type="dxa"/>
+            </w:tcMar>
+            <w:tcBorders>
+              <w:top w:val="single" w:sz="4" w:space="0" w:color="E2E8F0"/>
+              <w:left w:val="single" w:sz="4" w:space="0" w:color="E2E8F0"/>
+              <w:bottom w:val="single" w:sz="4" w:space="0" w:color="E2E8F0"/>
+              <w:right w:val="single" w:sz="4" w:space="0" w:color="E2E8F0"/>
+            </w:tcBorders>
+          </w:tcPr>
+          <w:p>
+            <w:r>
+              <w:rPr>
+                <w:sz w:val="17"/>
+              </w:rPr>
+              <w:t>/api/doctor/{id}</w:t>
+            </w:r>
+          </w:p>
+        </w:tc>
+        <w:tc>
+          <w:tcPr>
+            <w:tcW w:type="dxa" w:w="1152"/>
+            <w:shd w:fill="FFFFFF"/>
+            <w:tcMar>
+              <w:top w:w="70" w:type="dxa"/>
+              <w:bottom w:w="70" w:type="dxa"/>
+              <w:left w:w="80" w:type="dxa"/>
+              <w:right w:w="80" w:type="dxa"/>
+            </w:tcMar>
+            <w:tcBorders>
+              <w:top w:val="single" w:sz="4" w:space="0" w:color="E2E8F0"/>
+              <w:left w:val="single" w:sz="4" w:space="0" w:color="E2E8F0"/>
+              <w:bottom w:val="single" w:sz="4" w:space="0" w:color="E2E8F0"/>
+              <w:right w:val="single" w:sz="4" w:space="0" w:color="E2E8F0"/>
+            </w:tcBorders>
+          </w:tcPr>
+          <w:p>
+            <w:pPr>
+              <w:jc w:val="center"/>
+            </w:pPr>
+            <w:r>
+              <w:rPr>
+                <w:b/>
                 <w:color w:val="DC2626"/>
                 <w:sz w:val="17"/>
               </w:rPr>
               <w:t>DELETE</w:t>
+            </w:r>
+          </w:p>
+        </w:tc>
+        <w:tc>
+          <w:tcPr>
+            <w:tcW w:type="dxa" w:w="2448"/>
+            <w:shd w:fill="FFFFFF"/>
+            <w:tcMar>
+              <w:top w:w="70" w:type="dxa"/>
+              <w:bottom w:w="70" w:type="dxa"/>
+              <w:left w:w="80" w:type="dxa"/>
+              <w:right w:w="80" w:type="dxa"/>
+            </w:tcMar>
+            <w:tcBorders>
+              <w:top w:val="single" w:sz="4" w:space="0" w:color="E2E8F0"/>
+              <w:left w:val="single" w:sz="4" w:space="0" w:color="E2E8F0"/>
+              <w:bottom w:val="single" w:sz="4" w:space="0" w:color="E2E8F0"/>
+              <w:right w:val="single" w:sz="4" w:space="0" w:color="E2E8F0"/>
+            </w:tcBorders>
+          </w:tcPr>
+          <w:p>
+            <w:r>
+              <w:rPr>
+                <w:sz w:val="17"/>
+              </w:rPr>
+              <w:t>DoctorController</w:t>
+              <w:br/>
+              <w:t>DoctorService</w:t>
+            </w:r>
+          </w:p>
+        </w:tc>
+        <w:tc>
+          <w:tcPr>
+            <w:tcW w:type="dxa" w:w="2880"/>
+            <w:shd w:fill="FFFFFF"/>
+            <w:tcMar>
+              <w:top w:w="70" w:type="dxa"/>
+              <w:bottom w:w="70" w:type="dxa"/>
+              <w:left w:w="80" w:type="dxa"/>
+              <w:right w:w="80" w:type="dxa"/>
+            </w:tcMar>
+            <w:tcBorders>
+              <w:top w:val="single" w:sz="4" w:space="0" w:color="E2E8F0"/>
+              <w:left w:val="single" w:sz="4" w:space="0" w:color="E2E8F0"/>
+              <w:bottom w:val="single" w:sz="4" w:space="0" w:color="E2E8F0"/>
+              <w:right w:val="single" w:sz="4" w:space="0" w:color="E2E8F0"/>
+            </w:tcBorders>
+          </w:tcPr>
+          <w:p>
+            <w:r>
+              <w:rPr>
+                <w:sz w:val="17"/>
+              </w:rPr>
+              <w:t>Xóa bác sĩ khỏi CSDL theo ID có xử lý ràng buộc toàn vẹn lịch khám bệnh.</w:t>
+            </w:r>
+          </w:p>
+        </w:tc>
+      </w:tr>
+      <w:tr>
+        <w:tc>
+          <w:tcPr>
+            <w:tcW w:type="dxa" w:w="3168"/>
+            <w:shd w:fill="F8FAFC"/>
+            <w:tcMar>
+              <w:top w:w="70" w:type="dxa"/>
+              <w:bottom w:w="70" w:type="dxa"/>
+              <w:left w:w="80" w:type="dxa"/>
+              <w:right w:w="80" w:type="dxa"/>
+            </w:tcMar>
+            <w:tcBorders>
+              <w:top w:val="single" w:sz="4" w:space="0" w:color="E2E8F0"/>
+              <w:left w:val="single" w:sz="4" w:space="0" w:color="E2E8F0"/>
+              <w:bottom w:val="single" w:sz="4" w:space="0" w:color="E2E8F0"/>
+              <w:right w:val="single" w:sz="4" w:space="0" w:color="E2E8F0"/>
+            </w:tcBorders>
+          </w:tcPr>
+          <w:p>
+            <w:r>
+              <w:rPr>
+                <w:sz w:val="17"/>
+              </w:rPr>
+              <w:t>/api/doctor/all</w:t>
+            </w:r>
+          </w:p>
+        </w:tc>
+        <w:tc>
+          <w:tcPr>
+            <w:tcW w:type="dxa" w:w="1152"/>
+            <w:shd w:fill="F8FAFC"/>
+            <w:tcMar>
+              <w:top w:w="70" w:type="dxa"/>
+              <w:bottom w:w="70" w:type="dxa"/>
+              <w:left w:w="80" w:type="dxa"/>
+              <w:right w:w="80" w:type="dxa"/>
+            </w:tcMar>
+            <w:tcBorders>
+              <w:top w:val="single" w:sz="4" w:space="0" w:color="E2E8F0"/>
+              <w:left w:val="single" w:sz="4" w:space="0" w:color="E2E8F0"/>
+              <w:bottom w:val="single" w:sz="4" w:space="0" w:color="E2E8F0"/>
+              <w:right w:val="single" w:sz="4" w:space="0" w:color="E2E8F0"/>
+            </w:tcBorders>
+          </w:tcPr>
+          <w:p>
+            <w:pPr>
+              <w:jc w:val="center"/>
+            </w:pPr>
+            <w:r>
+              <w:rPr>
+                <w:b/>
+                <w:color w:val="2563EB"/>
+                <w:sz w:val="17"/>
+              </w:rPr>
+              <w:t>GET</w:t>
             </w:r>
           </w:p>
         </w:tc>
@@ -1970,7 +2096,7 @@
               <w:rPr>
                 <w:sz w:val="17"/>
               </w:rPr>
-              <w:t>Xóa bác sĩ khỏi CSDL theo ID có xử lý ràng buộc toàn vẹn lịch khám bệnh.</w:t>
+              <w:t>Lấy danh sách toàn bộ bác sĩ công tác tại phòng khám kèm chuyên khoa.</w:t>
             </w:r>
           </w:p>
         </w:tc>
@@ -1998,7 +2124,7 @@
               <w:rPr>
                 <w:sz w:val="17"/>
               </w:rPr>
-              <w:t>/api/doctor/all</w:t>
+              <w:t>/api/specialty/all</w:t>
             </w:r>
           </w:p>
         </w:tc>
@@ -2055,9 +2181,9 @@
               <w:rPr>
                 <w:sz w:val="17"/>
               </w:rPr>
-              <w:t>DoctorController</w:t>
+              <w:t>SpecialtyController</w:t>
               <w:br/>
-              <w:t>DoctorService</w:t>
+              <w:t>SpecialtyService</w:t>
             </w:r>
           </w:p>
         </w:tc>
@@ -2083,7 +2209,7 @@
               <w:rPr>
                 <w:sz w:val="17"/>
               </w:rPr>
-              <w:t>Lấy danh sách toàn bộ bác sĩ công tác tại phòng khám kèm chuyên khoa.</w:t>
+              <w:t>Lấy danh sách các chuyên khoa để phân công cho bác sĩ khi tạo tài khoản.</w:t>
             </w:r>
           </w:p>
         </w:tc>
@@ -2111,7 +2237,7 @@
               <w:rPr>
                 <w:sz w:val="17"/>
               </w:rPr>
-              <w:t>/api/specialty/all</w:t>
+              <w:t>/api/appointment/all</w:t>
             </w:r>
           </w:p>
         </w:tc>
@@ -2168,9 +2294,9 @@
               <w:rPr>
                 <w:sz w:val="17"/>
               </w:rPr>
-              <w:t>SpecialtyController</w:t>
+              <w:t>AppointmentController</w:t>
               <w:br/>
-              <w:t>SpecialtyService</w:t>
+              <w:t>AppointmentService</w:t>
             </w:r>
           </w:p>
         </w:tc>
@@ -2196,7 +2322,7 @@
               <w:rPr>
                 <w:sz w:val="17"/>
               </w:rPr>
-              <w:t>Lấy danh sách các chuyên khoa để phân công cho bác sĩ khi tạo tài khoản.</w:t>
+              <w:t>Lấy toàn bộ lịch hẹn khám trong toàn hệ thống phục vụ Admin Dashboard.</w:t>
             </w:r>
           </w:p>
         </w:tc>
@@ -2224,7 +2350,7 @@
               <w:rPr>
                 <w:sz w:val="17"/>
               </w:rPr>
-              <w:t>/api/appointment/all</w:t>
+              <w:t>/api/patient/all</w:t>
             </w:r>
           </w:p>
         </w:tc>
@@ -2281,119 +2407,6 @@
               <w:rPr>
                 <w:sz w:val="17"/>
               </w:rPr>
-              <w:t>AppointmentController</w:t>
-              <w:br/>
-              <w:t>AppointmentService</w:t>
-            </w:r>
-          </w:p>
-        </w:tc>
-        <w:tc>
-          <w:tcPr>
-            <w:tcW w:type="dxa" w:w="2880"/>
-            <w:shd w:fill="FFFFFF"/>
-            <w:tcMar>
-              <w:top w:w="70" w:type="dxa"/>
-              <w:bottom w:w="70" w:type="dxa"/>
-              <w:left w:w="80" w:type="dxa"/>
-              <w:right w:w="80" w:type="dxa"/>
-            </w:tcMar>
-            <w:tcBorders>
-              <w:top w:val="single" w:sz="4" w:space="0" w:color="E2E8F0"/>
-              <w:left w:val="single" w:sz="4" w:space="0" w:color="E2E8F0"/>
-              <w:bottom w:val="single" w:sz="4" w:space="0" w:color="E2E8F0"/>
-              <w:right w:val="single" w:sz="4" w:space="0" w:color="E2E8F0"/>
-            </w:tcBorders>
-          </w:tcPr>
-          <w:p>
-            <w:r>
-              <w:rPr>
-                <w:sz w:val="17"/>
-              </w:rPr>
-              <w:t>Lấy toàn bộ lịch hẹn khám trong toàn hệ thống phục vụ Admin Dashboard.</w:t>
-            </w:r>
-          </w:p>
-        </w:tc>
-      </w:tr>
-      <w:tr>
-        <w:tc>
-          <w:tcPr>
-            <w:tcW w:type="dxa" w:w="3168"/>
-            <w:shd w:fill="F8FAFC"/>
-            <w:tcMar>
-              <w:top w:w="70" w:type="dxa"/>
-              <w:bottom w:w="70" w:type="dxa"/>
-              <w:left w:w="80" w:type="dxa"/>
-              <w:right w:w="80" w:type="dxa"/>
-            </w:tcMar>
-            <w:tcBorders>
-              <w:top w:val="single" w:sz="4" w:space="0" w:color="E2E8F0"/>
-              <w:left w:val="single" w:sz="4" w:space="0" w:color="E2E8F0"/>
-              <w:bottom w:val="single" w:sz="4" w:space="0" w:color="E2E8F0"/>
-              <w:right w:val="single" w:sz="4" w:space="0" w:color="E2E8F0"/>
-            </w:tcBorders>
-          </w:tcPr>
-          <w:p>
-            <w:r>
-              <w:rPr>
-                <w:sz w:val="17"/>
-              </w:rPr>
-              <w:t>/api/patient/all</w:t>
-            </w:r>
-          </w:p>
-        </w:tc>
-        <w:tc>
-          <w:tcPr>
-            <w:tcW w:type="dxa" w:w="1152"/>
-            <w:shd w:fill="F8FAFC"/>
-            <w:tcMar>
-              <w:top w:w="70" w:type="dxa"/>
-              <w:bottom w:w="70" w:type="dxa"/>
-              <w:left w:w="80" w:type="dxa"/>
-              <w:right w:w="80" w:type="dxa"/>
-            </w:tcMar>
-            <w:tcBorders>
-              <w:top w:val="single" w:sz="4" w:space="0" w:color="E2E8F0"/>
-              <w:left w:val="single" w:sz="4" w:space="0" w:color="E2E8F0"/>
-              <w:bottom w:val="single" w:sz="4" w:space="0" w:color="E2E8F0"/>
-              <w:right w:val="single" w:sz="4" w:space="0" w:color="E2E8F0"/>
-            </w:tcBorders>
-          </w:tcPr>
-          <w:p>
-            <w:pPr>
-              <w:jc w:val="center"/>
-            </w:pPr>
-            <w:r>
-              <w:rPr>
-                <w:b/>
-                <w:color w:val="2563EB"/>
-                <w:sz w:val="17"/>
-              </w:rPr>
-              <w:t>GET</w:t>
-            </w:r>
-          </w:p>
-        </w:tc>
-        <w:tc>
-          <w:tcPr>
-            <w:tcW w:type="dxa" w:w="2448"/>
-            <w:shd w:fill="F8FAFC"/>
-            <w:tcMar>
-              <w:top w:w="70" w:type="dxa"/>
-              <w:bottom w:w="70" w:type="dxa"/>
-              <w:left w:w="80" w:type="dxa"/>
-              <w:right w:w="80" w:type="dxa"/>
-            </w:tcMar>
-            <w:tcBorders>
-              <w:top w:val="single" w:sz="4" w:space="0" w:color="E2E8F0"/>
-              <w:left w:val="single" w:sz="4" w:space="0" w:color="E2E8F0"/>
-              <w:bottom w:val="single" w:sz="4" w:space="0" w:color="E2E8F0"/>
-              <w:right w:val="single" w:sz="4" w:space="0" w:color="E2E8F0"/>
-            </w:tcBorders>
-          </w:tcPr>
-          <w:p>
-            <w:r>
-              <w:rPr>
-                <w:sz w:val="17"/>
-              </w:rPr>
               <w:t>PatientController</w:t>
               <w:br/>
               <w:t>PatientService</w:t>
@@ -2403,7 +2416,7 @@
         <w:tc>
           <w:tcPr>
             <w:tcW w:type="dxa" w:w="2880"/>
-            <w:shd w:fill="F8FAFC"/>
+            <w:shd w:fill="FFFFFF"/>
             <w:tcMar>
               <w:top w:w="70" w:type="dxa"/>
               <w:bottom w:w="70" w:type="dxa"/>

</xml_diff>

<commit_message>
feat: complete interactive API connections for all admin modules
</commit_message>
<xml_diff>
--- a/medical-appointment/docs/BAO_CAO_TIEN_DO_DU_AN.docx
+++ b/medical-appointment/docs/BAO_CAO_TIEN_DO_DU_AN.docx
@@ -2350,7 +2350,7 @@
               <w:rPr>
                 <w:sz w:val="17"/>
               </w:rPr>
-              <w:t>/api/patient/all</w:t>
+              <w:t>/api/appointment/admin/{id}/status</w:t>
             </w:r>
           </w:p>
         </w:tc>
@@ -2378,10 +2378,236 @@
             <w:r>
               <w:rPr>
                 <w:b/>
+                <w:color w:val="B45309"/>
+                <w:sz w:val="17"/>
+              </w:rPr>
+              <w:t>PUT</w:t>
+            </w:r>
+          </w:p>
+        </w:tc>
+        <w:tc>
+          <w:tcPr>
+            <w:tcW w:type="dxa" w:w="2448"/>
+            <w:shd w:fill="FFFFFF"/>
+            <w:tcMar>
+              <w:top w:w="70" w:type="dxa"/>
+              <w:bottom w:w="70" w:type="dxa"/>
+              <w:left w:w="80" w:type="dxa"/>
+              <w:right w:w="80" w:type="dxa"/>
+            </w:tcMar>
+            <w:tcBorders>
+              <w:top w:val="single" w:sz="4" w:space="0" w:color="E2E8F0"/>
+              <w:left w:val="single" w:sz="4" w:space="0" w:color="E2E8F0"/>
+              <w:bottom w:val="single" w:sz="4" w:space="0" w:color="E2E8F0"/>
+              <w:right w:val="single" w:sz="4" w:space="0" w:color="E2E8F0"/>
+            </w:tcBorders>
+          </w:tcPr>
+          <w:p>
+            <w:r>
+              <w:rPr>
+                <w:sz w:val="17"/>
+              </w:rPr>
+              <w:t>AppointmentController</w:t>
+              <w:br/>
+              <w:t>AppointmentService</w:t>
+            </w:r>
+          </w:p>
+        </w:tc>
+        <w:tc>
+          <w:tcPr>
+            <w:tcW w:type="dxa" w:w="2880"/>
+            <w:shd w:fill="FFFFFF"/>
+            <w:tcMar>
+              <w:top w:w="70" w:type="dxa"/>
+              <w:bottom w:w="70" w:type="dxa"/>
+              <w:left w:w="80" w:type="dxa"/>
+              <w:right w:w="80" w:type="dxa"/>
+            </w:tcMar>
+            <w:tcBorders>
+              <w:top w:val="single" w:sz="4" w:space="0" w:color="E2E8F0"/>
+              <w:left w:val="single" w:sz="4" w:space="0" w:color="E2E8F0"/>
+              <w:bottom w:val="single" w:sz="4" w:space="0" w:color="E2E8F0"/>
+              <w:right w:val="single" w:sz="4" w:space="0" w:color="E2E8F0"/>
+            </w:tcBorders>
+          </w:tcPr>
+          <w:p>
+            <w:r>
+              <w:rPr>
+                <w:sz w:val="17"/>
+              </w:rPr>
+              <w:t>Admin trực tiếp duyệt, hoàn tất hoặc hủy lịch khám bệnh của mọi chuyên khoa.</w:t>
+            </w:r>
+          </w:p>
+        </w:tc>
+      </w:tr>
+      <w:tr>
+        <w:tc>
+          <w:tcPr>
+            <w:tcW w:type="dxa" w:w="3168"/>
+            <w:shd w:fill="F8FAFC"/>
+            <w:tcMar>
+              <w:top w:w="70" w:type="dxa"/>
+              <w:bottom w:w="70" w:type="dxa"/>
+              <w:left w:w="80" w:type="dxa"/>
+              <w:right w:w="80" w:type="dxa"/>
+            </w:tcMar>
+            <w:tcBorders>
+              <w:top w:val="single" w:sz="4" w:space="0" w:color="E2E8F0"/>
+              <w:left w:val="single" w:sz="4" w:space="0" w:color="E2E8F0"/>
+              <w:bottom w:val="single" w:sz="4" w:space="0" w:color="E2E8F0"/>
+              <w:right w:val="single" w:sz="4" w:space="0" w:color="E2E8F0"/>
+            </w:tcBorders>
+          </w:tcPr>
+          <w:p>
+            <w:r>
+              <w:rPr>
+                <w:sz w:val="17"/>
+              </w:rPr>
+              <w:t>/api/patient/all</w:t>
+            </w:r>
+          </w:p>
+        </w:tc>
+        <w:tc>
+          <w:tcPr>
+            <w:tcW w:type="dxa" w:w="1152"/>
+            <w:shd w:fill="F8FAFC"/>
+            <w:tcMar>
+              <w:top w:w="70" w:type="dxa"/>
+              <w:bottom w:w="70" w:type="dxa"/>
+              <w:left w:w="80" w:type="dxa"/>
+              <w:right w:w="80" w:type="dxa"/>
+            </w:tcMar>
+            <w:tcBorders>
+              <w:top w:val="single" w:sz="4" w:space="0" w:color="E2E8F0"/>
+              <w:left w:val="single" w:sz="4" w:space="0" w:color="E2E8F0"/>
+              <w:bottom w:val="single" w:sz="4" w:space="0" w:color="E2E8F0"/>
+              <w:right w:val="single" w:sz="4" w:space="0" w:color="E2E8F0"/>
+            </w:tcBorders>
+          </w:tcPr>
+          <w:p>
+            <w:pPr>
+              <w:jc w:val="center"/>
+            </w:pPr>
+            <w:r>
+              <w:rPr>
+                <w:b/>
                 <w:color w:val="2563EB"/>
                 <w:sz w:val="17"/>
               </w:rPr>
               <w:t>GET</w:t>
+            </w:r>
+          </w:p>
+        </w:tc>
+        <w:tc>
+          <w:tcPr>
+            <w:tcW w:type="dxa" w:w="2448"/>
+            <w:shd w:fill="F8FAFC"/>
+            <w:tcMar>
+              <w:top w:w="70" w:type="dxa"/>
+              <w:bottom w:w="70" w:type="dxa"/>
+              <w:left w:w="80" w:type="dxa"/>
+              <w:right w:w="80" w:type="dxa"/>
+            </w:tcMar>
+            <w:tcBorders>
+              <w:top w:val="single" w:sz="4" w:space="0" w:color="E2E8F0"/>
+              <w:left w:val="single" w:sz="4" w:space="0" w:color="E2E8F0"/>
+              <w:bottom w:val="single" w:sz="4" w:space="0" w:color="E2E8F0"/>
+              <w:right w:val="single" w:sz="4" w:space="0" w:color="E2E8F0"/>
+            </w:tcBorders>
+          </w:tcPr>
+          <w:p>
+            <w:r>
+              <w:rPr>
+                <w:sz w:val="17"/>
+              </w:rPr>
+              <w:t>PatientController</w:t>
+              <w:br/>
+              <w:t>PatientService</w:t>
+            </w:r>
+          </w:p>
+        </w:tc>
+        <w:tc>
+          <w:tcPr>
+            <w:tcW w:type="dxa" w:w="2880"/>
+            <w:shd w:fill="F8FAFC"/>
+            <w:tcMar>
+              <w:top w:w="70" w:type="dxa"/>
+              <w:bottom w:w="70" w:type="dxa"/>
+              <w:left w:w="80" w:type="dxa"/>
+              <w:right w:w="80" w:type="dxa"/>
+            </w:tcMar>
+            <w:tcBorders>
+              <w:top w:val="single" w:sz="4" w:space="0" w:color="E2E8F0"/>
+              <w:left w:val="single" w:sz="4" w:space="0" w:color="E2E8F0"/>
+              <w:bottom w:val="single" w:sz="4" w:space="0" w:color="E2E8F0"/>
+              <w:right w:val="single" w:sz="4" w:space="0" w:color="E2E8F0"/>
+            </w:tcBorders>
+          </w:tcPr>
+          <w:p>
+            <w:r>
+              <w:rPr>
+                <w:sz w:val="17"/>
+              </w:rPr>
+              <w:t>Lấy danh sách toàn bộ hồ sơ bệnh nhân đã đăng ký trên hệ thống.</w:t>
+            </w:r>
+          </w:p>
+        </w:tc>
+      </w:tr>
+      <w:tr>
+        <w:tc>
+          <w:tcPr>
+            <w:tcW w:type="dxa" w:w="3168"/>
+            <w:shd w:fill="FFFFFF"/>
+            <w:tcMar>
+              <w:top w:w="70" w:type="dxa"/>
+              <w:bottom w:w="70" w:type="dxa"/>
+              <w:left w:w="80" w:type="dxa"/>
+              <w:right w:w="80" w:type="dxa"/>
+            </w:tcMar>
+            <w:tcBorders>
+              <w:top w:val="single" w:sz="4" w:space="0" w:color="E2E8F0"/>
+              <w:left w:val="single" w:sz="4" w:space="0" w:color="E2E8F0"/>
+              <w:bottom w:val="single" w:sz="4" w:space="0" w:color="E2E8F0"/>
+              <w:right w:val="single" w:sz="4" w:space="0" w:color="E2E8F0"/>
+            </w:tcBorders>
+          </w:tcPr>
+          <w:p>
+            <w:r>
+              <w:rPr>
+                <w:sz w:val="17"/>
+              </w:rPr>
+              <w:t>/api/patient/admin/{id}</w:t>
+            </w:r>
+          </w:p>
+        </w:tc>
+        <w:tc>
+          <w:tcPr>
+            <w:tcW w:type="dxa" w:w="1152"/>
+            <w:shd w:fill="FFFFFF"/>
+            <w:tcMar>
+              <w:top w:w="70" w:type="dxa"/>
+              <w:bottom w:w="70" w:type="dxa"/>
+              <w:left w:w="80" w:type="dxa"/>
+              <w:right w:w="80" w:type="dxa"/>
+            </w:tcMar>
+            <w:tcBorders>
+              <w:top w:val="single" w:sz="4" w:space="0" w:color="E2E8F0"/>
+              <w:left w:val="single" w:sz="4" w:space="0" w:color="E2E8F0"/>
+              <w:bottom w:val="single" w:sz="4" w:space="0" w:color="E2E8F0"/>
+              <w:right w:val="single" w:sz="4" w:space="0" w:color="E2E8F0"/>
+            </w:tcBorders>
+          </w:tcPr>
+          <w:p>
+            <w:pPr>
+              <w:jc w:val="center"/>
+            </w:pPr>
+            <w:r>
+              <w:rPr>
+                <w:b/>
+                <w:color w:val="DC2626"/>
+                <w:sz w:val="17"/>
+              </w:rPr>
+              <w:t>DELETE</w:t>
             </w:r>
           </w:p>
         </w:tc>
@@ -2435,7 +2661,7 @@
               <w:rPr>
                 <w:sz w:val="17"/>
               </w:rPr>
-              <w:t>Lấy danh sách toàn bộ hồ sơ bệnh nhân đã đăng ký trên hệ thống.</w:t>
+              <w:t>Admin xóa hồ sơ bệnh nhân khỏi hệ thống có kiểm tra an toàn dữ liệu lịch hẹn.</w:t>
             </w:r>
           </w:p>
         </w:tc>

</xml_diff>

<commit_message>
feat(admin): refactor Clean Architecture with AdminContext, component separation and reusable Pagination
</commit_message>
<xml_diff>
--- a/medical-appointment/docs/BAO_CAO_TIEN_DO_DU_AN.docx
+++ b/medical-appointment/docs/BAO_CAO_TIEN_DO_DU_AN.docx
@@ -4295,6 +4295,915 @@
         </w:tc>
       </w:tr>
     </w:tbl>
+    <w:p/>
+    <w:p>
+      <w:r>
+        <w:rPr>
+          <w:b/>
+          <w:color w:val="1E40AF"/>
+          <w:sz w:val="26"/>
+        </w:rPr>
+        <w:t>6. TÁI CẤU TRÚC CLEAN ARCHITECTURE: PHÂN TRANG (PAGINATION), COMPONENT &amp; CONTEXT</w:t>
+      </w:r>
+    </w:p>
+    <w:p>
+      <w:pPr>
+        <w:spacing w:after="120"/>
+      </w:pPr>
+      <w:r>
+        <w:t>Nhằm tối ưu hóa hiệu năng và tuân thủ các nguyên lý Clean Code / Separation of Concerns (SoC), toàn bộ phân hệ Admin đã được tái cấu trúc thành kiến trúc đa tầng hiện đại:</w:t>
+      </w:r>
+    </w:p>
+    <w:tbl>
+      <w:tblPr>
+        <w:tblW w:type="auto" w:w="0"/>
+        <w:jc w:val="center"/>
+        <w:tblLook w:firstColumn="1" w:firstRow="1" w:lastColumn="0" w:lastRow="0" w:noHBand="0" w:noVBand="1" w:val="04A0"/>
+      </w:tblPr>
+      <w:tblGrid>
+        <w:gridCol w:w="3216"/>
+        <w:gridCol w:w="3216"/>
+        <w:gridCol w:w="3216"/>
+      </w:tblGrid>
+      <w:tr>
+        <w:tc>
+          <w:tcPr>
+            <w:tcW w:type="dxa" w:w="2592"/>
+            <w:shd w:fill="1E3A8A"/>
+            <w:tcMar>
+              <w:top w:w="100" w:type="dxa"/>
+              <w:bottom w:w="100" w:type="dxa"/>
+              <w:left w:w="80" w:type="dxa"/>
+              <w:right w:w="80" w:type="dxa"/>
+            </w:tcMar>
+          </w:tcPr>
+          <w:p>
+            <w:r>
+              <w:rPr>
+                <w:b/>
+                <w:color w:val="FFFFFF"/>
+                <w:sz w:val="18"/>
+              </w:rPr>
+              <w:t>Thành phần kiến trúc</w:t>
+            </w:r>
+          </w:p>
+        </w:tc>
+        <w:tc>
+          <w:tcPr>
+            <w:tcW w:type="dxa" w:w="3168"/>
+            <w:shd w:fill="1E3A8A"/>
+            <w:tcMar>
+              <w:top w:w="100" w:type="dxa"/>
+              <w:bottom w:w="100" w:type="dxa"/>
+              <w:left w:w="80" w:type="dxa"/>
+              <w:right w:w="80" w:type="dxa"/>
+            </w:tcMar>
+          </w:tcPr>
+          <w:p>
+            <w:r>
+              <w:rPr>
+                <w:b/>
+                <w:color w:val="FFFFFF"/>
+                <w:sz w:val="18"/>
+              </w:rPr>
+              <w:t>Vị trí mã nguồn</w:t>
+            </w:r>
+          </w:p>
+        </w:tc>
+        <w:tc>
+          <w:tcPr>
+            <w:tcW w:type="dxa" w:w="3888"/>
+            <w:shd w:fill="1E3A8A"/>
+            <w:tcMar>
+              <w:top w:w="100" w:type="dxa"/>
+              <w:bottom w:w="100" w:type="dxa"/>
+              <w:left w:w="80" w:type="dxa"/>
+              <w:right w:w="80" w:type="dxa"/>
+            </w:tcMar>
+          </w:tcPr>
+          <w:p>
+            <w:r>
+              <w:rPr>
+                <w:b/>
+                <w:color w:val="FFFFFF"/>
+                <w:sz w:val="18"/>
+              </w:rPr>
+              <w:t>Mục đích &amp; Lợi ích tối ưu</w:t>
+            </w:r>
+          </w:p>
+        </w:tc>
+      </w:tr>
+      <w:tr>
+        <w:tc>
+          <w:tcPr>
+            <w:tcW w:type="dxa" w:w="2592"/>
+            <w:shd w:fill="FFFFFF"/>
+            <w:tcMar>
+              <w:top w:w="70" w:type="dxa"/>
+              <w:bottom w:w="70" w:type="dxa"/>
+              <w:left w:w="80" w:type="dxa"/>
+              <w:right w:w="80" w:type="dxa"/>
+            </w:tcMar>
+            <w:tcBorders>
+              <w:top w:val="single" w:sz="4" w:space="0" w:color="E2E8F0"/>
+              <w:left w:val="single" w:sz="4" w:space="0" w:color="E2E8F0"/>
+              <w:bottom w:val="single" w:sz="4" w:space="0" w:color="E2E8F0"/>
+              <w:right w:val="single" w:sz="4" w:space="0" w:color="E2E8F0"/>
+            </w:tcBorders>
+          </w:tcPr>
+          <w:p>
+            <w:r>
+              <w:rPr>
+                <w:b/>
+                <w:sz w:val="17"/>
+              </w:rPr>
+              <w:t>AdminContext &amp; useAdmin()</w:t>
+            </w:r>
+          </w:p>
+        </w:tc>
+        <w:tc>
+          <w:tcPr>
+            <w:tcW w:type="dxa" w:w="3168"/>
+            <w:shd w:fill="FFFFFF"/>
+            <w:tcMar>
+              <w:top w:w="70" w:type="dxa"/>
+              <w:bottom w:w="70" w:type="dxa"/>
+              <w:left w:w="80" w:type="dxa"/>
+              <w:right w:w="80" w:type="dxa"/>
+            </w:tcMar>
+            <w:tcBorders>
+              <w:top w:val="single" w:sz="4" w:space="0" w:color="E2E8F0"/>
+              <w:left w:val="single" w:sz="4" w:space="0" w:color="E2E8F0"/>
+              <w:bottom w:val="single" w:sz="4" w:space="0" w:color="E2E8F0"/>
+              <w:right w:val="single" w:sz="4" w:space="0" w:color="E2E8F0"/>
+            </w:tcBorders>
+          </w:tcPr>
+          <w:p>
+            <w:r>
+              <w:rPr>
+                <w:sz w:val="17"/>
+              </w:rPr>
+              <w:t>frontend/src/context/AdminContext.jsx</w:t>
+            </w:r>
+          </w:p>
+        </w:tc>
+        <w:tc>
+          <w:tcPr>
+            <w:tcW w:type="dxa" w:w="3888"/>
+            <w:shd w:fill="FFFFFF"/>
+            <w:tcMar>
+              <w:top w:w="70" w:type="dxa"/>
+              <w:bottom w:w="70" w:type="dxa"/>
+              <w:left w:w="80" w:type="dxa"/>
+              <w:right w:w="80" w:type="dxa"/>
+            </w:tcMar>
+            <w:tcBorders>
+              <w:top w:val="single" w:sz="4" w:space="0" w:color="E2E8F0"/>
+              <w:left w:val="single" w:sz="4" w:space="0" w:color="E2E8F0"/>
+              <w:bottom w:val="single" w:sz="4" w:space="0" w:color="E2E8F0"/>
+              <w:right w:val="single" w:sz="4" w:space="0" w:color="E2E8F0"/>
+            </w:tcBorders>
+          </w:tcPr>
+          <w:p>
+            <w:r>
+              <w:rPr>
+                <w:sz w:val="17"/>
+              </w:rPr>
+              <w:t>Quản lý trạng thái tập trung (Bác sĩ, Chuyên khoa, Lịch hẹn, Bệnh nhân, KPIs), triệt tiêu gọi trùng API và đồng bộ badge counters.</w:t>
+            </w:r>
+          </w:p>
+        </w:tc>
+      </w:tr>
+      <w:tr>
+        <w:tc>
+          <w:tcPr>
+            <w:tcW w:type="dxa" w:w="2592"/>
+            <w:shd w:fill="F8FAFC"/>
+            <w:tcMar>
+              <w:top w:w="70" w:type="dxa"/>
+              <w:bottom w:w="70" w:type="dxa"/>
+              <w:left w:w="80" w:type="dxa"/>
+              <w:right w:w="80" w:type="dxa"/>
+            </w:tcMar>
+            <w:tcBorders>
+              <w:top w:val="single" w:sz="4" w:space="0" w:color="E2E8F0"/>
+              <w:left w:val="single" w:sz="4" w:space="0" w:color="E2E8F0"/>
+              <w:bottom w:val="single" w:sz="4" w:space="0" w:color="E2E8F0"/>
+              <w:right w:val="single" w:sz="4" w:space="0" w:color="E2E8F0"/>
+            </w:tcBorders>
+          </w:tcPr>
+          <w:p>
+            <w:r>
+              <w:rPr>
+                <w:b/>
+                <w:sz w:val="17"/>
+              </w:rPr>
+              <w:t>Component Phân trang dùng chung</w:t>
+            </w:r>
+          </w:p>
+        </w:tc>
+        <w:tc>
+          <w:tcPr>
+            <w:tcW w:type="dxa" w:w="3168"/>
+            <w:shd w:fill="F8FAFC"/>
+            <w:tcMar>
+              <w:top w:w="70" w:type="dxa"/>
+              <w:bottom w:w="70" w:type="dxa"/>
+              <w:left w:w="80" w:type="dxa"/>
+              <w:right w:w="80" w:type="dxa"/>
+            </w:tcMar>
+            <w:tcBorders>
+              <w:top w:val="single" w:sz="4" w:space="0" w:color="E2E8F0"/>
+              <w:left w:val="single" w:sz="4" w:space="0" w:color="E2E8F0"/>
+              <w:bottom w:val="single" w:sz="4" w:space="0" w:color="E2E8F0"/>
+              <w:right w:val="single" w:sz="4" w:space="0" w:color="E2E8F0"/>
+            </w:tcBorders>
+          </w:tcPr>
+          <w:p>
+            <w:r>
+              <w:rPr>
+                <w:sz w:val="17"/>
+              </w:rPr>
+              <w:t>frontend/src/component/common/Pagination.jsx</w:t>
+            </w:r>
+          </w:p>
+        </w:tc>
+        <w:tc>
+          <w:tcPr>
+            <w:tcW w:type="dxa" w:w="3888"/>
+            <w:shd w:fill="F8FAFC"/>
+            <w:tcMar>
+              <w:top w:w="70" w:type="dxa"/>
+              <w:bottom w:w="70" w:type="dxa"/>
+              <w:left w:w="80" w:type="dxa"/>
+              <w:right w:w="80" w:type="dxa"/>
+            </w:tcMar>
+            <w:tcBorders>
+              <w:top w:val="single" w:sz="4" w:space="0" w:color="E2E8F0"/>
+              <w:left w:val="single" w:sz="4" w:space="0" w:color="E2E8F0"/>
+              <w:bottom w:val="single" w:sz="4" w:space="0" w:color="E2E8F0"/>
+              <w:right w:val="single" w:sz="4" w:space="0" w:color="E2E8F0"/>
+            </w:tcBorders>
+          </w:tcPr>
+          <w:p>
+            <w:r>
+              <w:rPr>
+                <w:sz w:val="17"/>
+              </w:rPr>
+              <w:t>Điều hướng trang (&lt;&lt;, &lt;, số trang, &gt;, &gt;&gt;), chọn số dòng/trang (5, 10, 20, 50), tự động reset về trang 1 khi tìm kiếm.</w:t>
+            </w:r>
+          </w:p>
+        </w:tc>
+      </w:tr>
+      <w:tr>
+        <w:tc>
+          <w:tcPr>
+            <w:tcW w:type="dxa" w:w="2592"/>
+            <w:shd w:fill="FFFFFF"/>
+            <w:tcMar>
+              <w:top w:w="70" w:type="dxa"/>
+              <w:bottom w:w="70" w:type="dxa"/>
+              <w:left w:w="80" w:type="dxa"/>
+              <w:right w:w="80" w:type="dxa"/>
+            </w:tcMar>
+            <w:tcBorders>
+              <w:top w:val="single" w:sz="4" w:space="0" w:color="E2E8F0"/>
+              <w:left w:val="single" w:sz="4" w:space="0" w:color="E2E8F0"/>
+              <w:bottom w:val="single" w:sz="4" w:space="0" w:color="E2E8F0"/>
+              <w:right w:val="single" w:sz="4" w:space="0" w:color="E2E8F0"/>
+            </w:tcBorders>
+          </w:tcPr>
+          <w:p>
+            <w:r>
+              <w:rPr>
+                <w:b/>
+                <w:sz w:val="17"/>
+              </w:rPr>
+              <w:t>Thẻ KPI Tái sử dụng</w:t>
+            </w:r>
+          </w:p>
+        </w:tc>
+        <w:tc>
+          <w:tcPr>
+            <w:tcW w:type="dxa" w:w="3168"/>
+            <w:shd w:fill="FFFFFF"/>
+            <w:tcMar>
+              <w:top w:w="70" w:type="dxa"/>
+              <w:bottom w:w="70" w:type="dxa"/>
+              <w:left w:w="80" w:type="dxa"/>
+              <w:right w:w="80" w:type="dxa"/>
+            </w:tcMar>
+            <w:tcBorders>
+              <w:top w:val="single" w:sz="4" w:space="0" w:color="E2E8F0"/>
+              <w:left w:val="single" w:sz="4" w:space="0" w:color="E2E8F0"/>
+              <w:bottom w:val="single" w:sz="4" w:space="0" w:color="E2E8F0"/>
+              <w:right w:val="single" w:sz="4" w:space="0" w:color="E2E8F0"/>
+            </w:tcBorders>
+          </w:tcPr>
+          <w:p>
+            <w:r>
+              <w:rPr>
+                <w:sz w:val="17"/>
+              </w:rPr>
+              <w:t>frontend/src/component/admin/StatCard.jsx</w:t>
+            </w:r>
+          </w:p>
+        </w:tc>
+        <w:tc>
+          <w:tcPr>
+            <w:tcW w:type="dxa" w:w="3888"/>
+            <w:shd w:fill="FFFFFF"/>
+            <w:tcMar>
+              <w:top w:w="70" w:type="dxa"/>
+              <w:bottom w:w="70" w:type="dxa"/>
+              <w:left w:w="80" w:type="dxa"/>
+              <w:right w:w="80" w:type="dxa"/>
+            </w:tcMar>
+            <w:tcBorders>
+              <w:top w:val="single" w:sz="4" w:space="0" w:color="E2E8F0"/>
+              <w:left w:val="single" w:sz="4" w:space="0" w:color="E2E8F0"/>
+              <w:bottom w:val="single" w:sz="4" w:space="0" w:color="E2E8F0"/>
+              <w:right w:val="single" w:sz="4" w:space="0" w:color="E2E8F0"/>
+            </w:tcBorders>
+          </w:tcPr>
+          <w:p>
+            <w:r>
+              <w:rPr>
+                <w:sz w:val="17"/>
+              </w:rPr>
+              <w:t>Hiển thị số liệu thống kê Dashboard với thanh gradient, biểu tượng sinh động và nhãn phân loại.</w:t>
+            </w:r>
+          </w:p>
+        </w:tc>
+      </w:tr>
+      <w:tr>
+        <w:tc>
+          <w:tcPr>
+            <w:tcW w:type="dxa" w:w="2592"/>
+            <w:shd w:fill="F8FAFC"/>
+            <w:tcMar>
+              <w:top w:w="70" w:type="dxa"/>
+              <w:bottom w:w="70" w:type="dxa"/>
+              <w:left w:w="80" w:type="dxa"/>
+              <w:right w:w="80" w:type="dxa"/>
+            </w:tcMar>
+            <w:tcBorders>
+              <w:top w:val="single" w:sz="4" w:space="0" w:color="E2E8F0"/>
+              <w:left w:val="single" w:sz="4" w:space="0" w:color="E2E8F0"/>
+              <w:bottom w:val="single" w:sz="4" w:space="0" w:color="E2E8F0"/>
+              <w:right w:val="single" w:sz="4" w:space="0" w:color="E2E8F0"/>
+            </w:tcBorders>
+          </w:tcPr>
+          <w:p>
+            <w:r>
+              <w:rPr>
+                <w:b/>
+                <w:sz w:val="17"/>
+              </w:rPr>
+              <w:t>Bảng Bác sĩ &amp; Thao tác</w:t>
+            </w:r>
+          </w:p>
+        </w:tc>
+        <w:tc>
+          <w:tcPr>
+            <w:tcW w:type="dxa" w:w="3168"/>
+            <w:shd w:fill="F8FAFC"/>
+            <w:tcMar>
+              <w:top w:w="70" w:type="dxa"/>
+              <w:bottom w:w="70" w:type="dxa"/>
+              <w:left w:w="80" w:type="dxa"/>
+              <w:right w:w="80" w:type="dxa"/>
+            </w:tcMar>
+            <w:tcBorders>
+              <w:top w:val="single" w:sz="4" w:space="0" w:color="E2E8F0"/>
+              <w:left w:val="single" w:sz="4" w:space="0" w:color="E2E8F0"/>
+              <w:bottom w:val="single" w:sz="4" w:space="0" w:color="E2E8F0"/>
+              <w:right w:val="single" w:sz="4" w:space="0" w:color="E2E8F0"/>
+            </w:tcBorders>
+          </w:tcPr>
+          <w:p>
+            <w:r>
+              <w:rPr>
+                <w:sz w:val="17"/>
+              </w:rPr>
+              <w:t>frontend/src/component/admin/DoctorTable.jsx</w:t>
+            </w:r>
+          </w:p>
+        </w:tc>
+        <w:tc>
+          <w:tcPr>
+            <w:tcW w:type="dxa" w:w="3888"/>
+            <w:shd w:fill="F8FAFC"/>
+            <w:tcMar>
+              <w:top w:w="70" w:type="dxa"/>
+              <w:bottom w:w="70" w:type="dxa"/>
+              <w:left w:w="80" w:type="dxa"/>
+              <w:right w:w="80" w:type="dxa"/>
+            </w:tcMar>
+            <w:tcBorders>
+              <w:top w:val="single" w:sz="4" w:space="0" w:color="E2E8F0"/>
+              <w:left w:val="single" w:sz="4" w:space="0" w:color="E2E8F0"/>
+              <w:bottom w:val="single" w:sz="4" w:space="0" w:color="E2E8F0"/>
+              <w:right w:val="single" w:sz="4" w:space="0" w:color="E2E8F0"/>
+            </w:tcBorders>
+          </w:tcPr>
+          <w:p>
+            <w:r>
+              <w:rPr>
+                <w:sz w:val="17"/>
+              </w:rPr>
+              <w:t>Hiển thị bảng bác sĩ kèm avatar, chuyên khoa, mức phí, kinh nghiệm và nhóm nút thao tác sửa/đổi pass/xóa.</w:t>
+            </w:r>
+          </w:p>
+        </w:tc>
+      </w:tr>
+      <w:tr>
+        <w:tc>
+          <w:tcPr>
+            <w:tcW w:type="dxa" w:w="2592"/>
+            <w:shd w:fill="FFFFFF"/>
+            <w:tcMar>
+              <w:top w:w="70" w:type="dxa"/>
+              <w:bottom w:w="70" w:type="dxa"/>
+              <w:left w:w="80" w:type="dxa"/>
+              <w:right w:w="80" w:type="dxa"/>
+            </w:tcMar>
+            <w:tcBorders>
+              <w:top w:val="single" w:sz="4" w:space="0" w:color="E2E8F0"/>
+              <w:left w:val="single" w:sz="4" w:space="0" w:color="E2E8F0"/>
+              <w:bottom w:val="single" w:sz="4" w:space="0" w:color="E2E8F0"/>
+              <w:right w:val="single" w:sz="4" w:space="0" w:color="E2E8F0"/>
+            </w:tcBorders>
+          </w:tcPr>
+          <w:p>
+            <w:r>
+              <w:rPr>
+                <w:b/>
+                <w:sz w:val="17"/>
+              </w:rPr>
+              <w:t>Dialog Cấp Tài Khoản Bác Sĩ</w:t>
+            </w:r>
+          </w:p>
+        </w:tc>
+        <w:tc>
+          <w:tcPr>
+            <w:tcW w:type="dxa" w:w="3168"/>
+            <w:shd w:fill="FFFFFF"/>
+            <w:tcMar>
+              <w:top w:w="70" w:type="dxa"/>
+              <w:bottom w:w="70" w:type="dxa"/>
+              <w:left w:w="80" w:type="dxa"/>
+              <w:right w:w="80" w:type="dxa"/>
+            </w:tcMar>
+            <w:tcBorders>
+              <w:top w:val="single" w:sz="4" w:space="0" w:color="E2E8F0"/>
+              <w:left w:val="single" w:sz="4" w:space="0" w:color="E2E8F0"/>
+              <w:bottom w:val="single" w:sz="4" w:space="0" w:color="E2E8F0"/>
+              <w:right w:val="single" w:sz="4" w:space="0" w:color="E2E8F0"/>
+            </w:tcBorders>
+          </w:tcPr>
+          <w:p>
+            <w:r>
+              <w:rPr>
+                <w:sz w:val="17"/>
+              </w:rPr>
+              <w:t>frontend/src/component/admin/DoctorCreateModal.jsx</w:t>
+            </w:r>
+          </w:p>
+        </w:tc>
+        <w:tc>
+          <w:tcPr>
+            <w:tcW w:type="dxa" w:w="3888"/>
+            <w:shd w:fill="FFFFFF"/>
+            <w:tcMar>
+              <w:top w:w="70" w:type="dxa"/>
+              <w:bottom w:w="70" w:type="dxa"/>
+              <w:left w:w="80" w:type="dxa"/>
+              <w:right w:w="80" w:type="dxa"/>
+            </w:tcMar>
+            <w:tcBorders>
+              <w:top w:val="single" w:sz="4" w:space="0" w:color="E2E8F0"/>
+              <w:left w:val="single" w:sz="4" w:space="0" w:color="E2E8F0"/>
+              <w:bottom w:val="single" w:sz="4" w:space="0" w:color="E2E8F0"/>
+              <w:right w:val="single" w:sz="4" w:space="0" w:color="E2E8F0"/>
+            </w:tcBorders>
+          </w:tcPr>
+          <w:p>
+            <w:r>
+              <w:rPr>
+                <w:sz w:val="17"/>
+              </w:rPr>
+              <w:t>Tải avatar từ máy tính người dùng, sinh mật khẩu ngẫu nhiên, phân công chuyên khoa và tích hợp geocoding.</w:t>
+            </w:r>
+          </w:p>
+        </w:tc>
+      </w:tr>
+      <w:tr>
+        <w:tc>
+          <w:tcPr>
+            <w:tcW w:type="dxa" w:w="2592"/>
+            <w:shd w:fill="F8FAFC"/>
+            <w:tcMar>
+              <w:top w:w="70" w:type="dxa"/>
+              <w:bottom w:w="70" w:type="dxa"/>
+              <w:left w:w="80" w:type="dxa"/>
+              <w:right w:w="80" w:type="dxa"/>
+            </w:tcMar>
+            <w:tcBorders>
+              <w:top w:val="single" w:sz="4" w:space="0" w:color="E2E8F0"/>
+              <w:left w:val="single" w:sz="4" w:space="0" w:color="E2E8F0"/>
+              <w:bottom w:val="single" w:sz="4" w:space="0" w:color="E2E8F0"/>
+              <w:right w:val="single" w:sz="4" w:space="0" w:color="E2E8F0"/>
+            </w:tcBorders>
+          </w:tcPr>
+          <w:p>
+            <w:r>
+              <w:rPr>
+                <w:b/>
+                <w:sz w:val="17"/>
+              </w:rPr>
+              <w:t>Phiếu Bàn Giao Tài Khoản</w:t>
+            </w:r>
+          </w:p>
+        </w:tc>
+        <w:tc>
+          <w:tcPr>
+            <w:tcW w:type="dxa" w:w="3168"/>
+            <w:shd w:fill="F8FAFC"/>
+            <w:tcMar>
+              <w:top w:w="70" w:type="dxa"/>
+              <w:bottom w:w="70" w:type="dxa"/>
+              <w:left w:w="80" w:type="dxa"/>
+              <w:right w:w="80" w:type="dxa"/>
+            </w:tcMar>
+            <w:tcBorders>
+              <w:top w:val="single" w:sz="4" w:space="0" w:color="E2E8F0"/>
+              <w:left w:val="single" w:sz="4" w:space="0" w:color="E2E8F0"/>
+              <w:bottom w:val="single" w:sz="4" w:space="0" w:color="E2E8F0"/>
+              <w:right w:val="single" w:sz="4" w:space="0" w:color="E2E8F0"/>
+            </w:tcBorders>
+          </w:tcPr>
+          <w:p>
+            <w:r>
+              <w:rPr>
+                <w:sz w:val="17"/>
+              </w:rPr>
+              <w:t>frontend/src/component/admin/DoctorVoucherModal.jsx</w:t>
+            </w:r>
+          </w:p>
+        </w:tc>
+        <w:tc>
+          <w:tcPr>
+            <w:tcW w:type="dxa" w:w="3888"/>
+            <w:shd w:fill="F8FAFC"/>
+            <w:tcMar>
+              <w:top w:w="70" w:type="dxa"/>
+              <w:bottom w:w="70" w:type="dxa"/>
+              <w:left w:w="80" w:type="dxa"/>
+              <w:right w:w="80" w:type="dxa"/>
+            </w:tcMar>
+            <w:tcBorders>
+              <w:top w:val="single" w:sz="4" w:space="0" w:color="E2E8F0"/>
+              <w:left w:val="single" w:sz="4" w:space="0" w:color="E2E8F0"/>
+              <w:bottom w:val="single" w:sz="4" w:space="0" w:color="E2E8F0"/>
+              <w:right w:val="single" w:sz="4" w:space="0" w:color="E2E8F0"/>
+            </w:tcBorders>
+          </w:tcPr>
+          <w:p>
+            <w:r>
+              <w:rPr>
+                <w:sz w:val="17"/>
+              </w:rPr>
+              <w:t>Hiển thị thông tin tài khoản bác sĩ vừa cấp với nút 1-click sao chép định dạng văn bản gửi bác sĩ.</w:t>
+            </w:r>
+          </w:p>
+        </w:tc>
+      </w:tr>
+      <w:tr>
+        <w:tc>
+          <w:tcPr>
+            <w:tcW w:type="dxa" w:w="2592"/>
+            <w:shd w:fill="FFFFFF"/>
+            <w:tcMar>
+              <w:top w:w="70" w:type="dxa"/>
+              <w:bottom w:w="70" w:type="dxa"/>
+              <w:left w:w="80" w:type="dxa"/>
+              <w:right w:w="80" w:type="dxa"/>
+            </w:tcMar>
+            <w:tcBorders>
+              <w:top w:val="single" w:sz="4" w:space="0" w:color="E2E8F0"/>
+              <w:left w:val="single" w:sz="4" w:space="0" w:color="E2E8F0"/>
+              <w:bottom w:val="single" w:sz="4" w:space="0" w:color="E2E8F0"/>
+              <w:right w:val="single" w:sz="4" w:space="0" w:color="E2E8F0"/>
+            </w:tcBorders>
+          </w:tcPr>
+          <w:p>
+            <w:r>
+              <w:rPr>
+                <w:b/>
+                <w:sz w:val="17"/>
+              </w:rPr>
+              <w:t>Dialog Sửa &amp; Đổi Chuyên Khoa</w:t>
+            </w:r>
+          </w:p>
+        </w:tc>
+        <w:tc>
+          <w:tcPr>
+            <w:tcW w:type="dxa" w:w="3168"/>
+            <w:shd w:fill="FFFFFF"/>
+            <w:tcMar>
+              <w:top w:w="70" w:type="dxa"/>
+              <w:bottom w:w="70" w:type="dxa"/>
+              <w:left w:w="80" w:type="dxa"/>
+              <w:right w:w="80" w:type="dxa"/>
+            </w:tcMar>
+            <w:tcBorders>
+              <w:top w:val="single" w:sz="4" w:space="0" w:color="E2E8F0"/>
+              <w:left w:val="single" w:sz="4" w:space="0" w:color="E2E8F0"/>
+              <w:bottom w:val="single" w:sz="4" w:space="0" w:color="E2E8F0"/>
+              <w:right w:val="single" w:sz="4" w:space="0" w:color="E2E8F0"/>
+            </w:tcBorders>
+          </w:tcPr>
+          <w:p>
+            <w:r>
+              <w:rPr>
+                <w:sz w:val="17"/>
+              </w:rPr>
+              <w:t>frontend/src/component/admin/DoctorEditModal.jsx</w:t>
+            </w:r>
+          </w:p>
+        </w:tc>
+        <w:tc>
+          <w:tcPr>
+            <w:tcW w:type="dxa" w:w="3888"/>
+            <w:shd w:fill="FFFFFF"/>
+            <w:tcMar>
+              <w:top w:w="70" w:type="dxa"/>
+              <w:bottom w:w="70" w:type="dxa"/>
+              <w:left w:w="80" w:type="dxa"/>
+              <w:right w:w="80" w:type="dxa"/>
+            </w:tcMar>
+            <w:tcBorders>
+              <w:top w:val="single" w:sz="4" w:space="0" w:color="E2E8F0"/>
+              <w:left w:val="single" w:sz="4" w:space="0" w:color="E2E8F0"/>
+              <w:bottom w:val="single" w:sz="4" w:space="0" w:color="E2E8F0"/>
+              <w:right w:val="single" w:sz="4" w:space="0" w:color="E2E8F0"/>
+            </w:tcBorders>
+          </w:tcPr>
+          <w:p>
+            <w:r>
+              <w:rPr>
+                <w:sz w:val="17"/>
+              </w:rPr>
+              <w:t>Chỉnh sửa thông tin bác sĩ, điều chuyển khoa và tải ảnh đại diện mới từ thiết bị.</w:t>
+            </w:r>
+          </w:p>
+        </w:tc>
+      </w:tr>
+      <w:tr>
+        <w:tc>
+          <w:tcPr>
+            <w:tcW w:type="dxa" w:w="2592"/>
+            <w:shd w:fill="F8FAFC"/>
+            <w:tcMar>
+              <w:top w:w="70" w:type="dxa"/>
+              <w:bottom w:w="70" w:type="dxa"/>
+              <w:left w:w="80" w:type="dxa"/>
+              <w:right w:w="80" w:type="dxa"/>
+            </w:tcMar>
+            <w:tcBorders>
+              <w:top w:val="single" w:sz="4" w:space="0" w:color="E2E8F0"/>
+              <w:left w:val="single" w:sz="4" w:space="0" w:color="E2E8F0"/>
+              <w:bottom w:val="single" w:sz="4" w:space="0" w:color="E2E8F0"/>
+              <w:right w:val="single" w:sz="4" w:space="0" w:color="E2E8F0"/>
+            </w:tcBorders>
+          </w:tcPr>
+          <w:p>
+            <w:r>
+              <w:rPr>
+                <w:b/>
+                <w:sz w:val="17"/>
+              </w:rPr>
+              <w:t>Dialog Cấp Lại Mật Khẩu</w:t>
+            </w:r>
+          </w:p>
+        </w:tc>
+        <w:tc>
+          <w:tcPr>
+            <w:tcW w:type="dxa" w:w="3168"/>
+            <w:shd w:fill="F8FAFC"/>
+            <w:tcMar>
+              <w:top w:w="70" w:type="dxa"/>
+              <w:bottom w:w="70" w:type="dxa"/>
+              <w:left w:w="80" w:type="dxa"/>
+              <w:right w:w="80" w:type="dxa"/>
+            </w:tcMar>
+            <w:tcBorders>
+              <w:top w:val="single" w:sz="4" w:space="0" w:color="E2E8F0"/>
+              <w:left w:val="single" w:sz="4" w:space="0" w:color="E2E8F0"/>
+              <w:bottom w:val="single" w:sz="4" w:space="0" w:color="E2E8F0"/>
+              <w:right w:val="single" w:sz="4" w:space="0" w:color="E2E8F0"/>
+            </w:tcBorders>
+          </w:tcPr>
+          <w:p>
+            <w:r>
+              <w:rPr>
+                <w:sz w:val="17"/>
+              </w:rPr>
+              <w:t>frontend/src/component/admin/DoctorResetPasswordModal.jsx</w:t>
+            </w:r>
+          </w:p>
+        </w:tc>
+        <w:tc>
+          <w:tcPr>
+            <w:tcW w:type="dxa" w:w="3888"/>
+            <w:shd w:fill="F8FAFC"/>
+            <w:tcMar>
+              <w:top w:w="70" w:type="dxa"/>
+              <w:bottom w:w="70" w:type="dxa"/>
+              <w:left w:w="80" w:type="dxa"/>
+              <w:right w:w="80" w:type="dxa"/>
+            </w:tcMar>
+            <w:tcBorders>
+              <w:top w:val="single" w:sz="4" w:space="0" w:color="E2E8F0"/>
+              <w:left w:val="single" w:sz="4" w:space="0" w:color="E2E8F0"/>
+              <w:bottom w:val="single" w:sz="4" w:space="0" w:color="E2E8F0"/>
+              <w:right w:val="single" w:sz="4" w:space="0" w:color="E2E8F0"/>
+            </w:tcBorders>
+          </w:tcPr>
+          <w:p>
+            <w:r>
+              <w:rPr>
+                <w:sz w:val="17"/>
+              </w:rPr>
+              <w:t>Đổi mật khẩu nhanh cho bác sĩ trong popup và sao chép mật khẩu mới.</w:t>
+            </w:r>
+          </w:p>
+        </w:tc>
+      </w:tr>
+      <w:tr>
+        <w:tc>
+          <w:tcPr>
+            <w:tcW w:type="dxa" w:w="2592"/>
+            <w:shd w:fill="FFFFFF"/>
+            <w:tcMar>
+              <w:top w:w="70" w:type="dxa"/>
+              <w:bottom w:w="70" w:type="dxa"/>
+              <w:left w:w="80" w:type="dxa"/>
+              <w:right w:w="80" w:type="dxa"/>
+            </w:tcMar>
+            <w:tcBorders>
+              <w:top w:val="single" w:sz="4" w:space="0" w:color="E2E8F0"/>
+              <w:left w:val="single" w:sz="4" w:space="0" w:color="E2E8F0"/>
+              <w:bottom w:val="single" w:sz="4" w:space="0" w:color="E2E8F0"/>
+              <w:right w:val="single" w:sz="4" w:space="0" w:color="E2E8F0"/>
+            </w:tcBorders>
+          </w:tcPr>
+          <w:p>
+            <w:r>
+              <w:rPr>
+                <w:b/>
+                <w:sz w:val="17"/>
+              </w:rPr>
+              <w:t>Bảng Lịch Hẹn Toàn Viện</w:t>
+            </w:r>
+          </w:p>
+        </w:tc>
+        <w:tc>
+          <w:tcPr>
+            <w:tcW w:type="dxa" w:w="3168"/>
+            <w:shd w:fill="FFFFFF"/>
+            <w:tcMar>
+              <w:top w:w="70" w:type="dxa"/>
+              <w:bottom w:w="70" w:type="dxa"/>
+              <w:left w:w="80" w:type="dxa"/>
+              <w:right w:w="80" w:type="dxa"/>
+            </w:tcMar>
+            <w:tcBorders>
+              <w:top w:val="single" w:sz="4" w:space="0" w:color="E2E8F0"/>
+              <w:left w:val="single" w:sz="4" w:space="0" w:color="E2E8F0"/>
+              <w:bottom w:val="single" w:sz="4" w:space="0" w:color="E2E8F0"/>
+              <w:right w:val="single" w:sz="4" w:space="0" w:color="E2E8F0"/>
+            </w:tcBorders>
+          </w:tcPr>
+          <w:p>
+            <w:r>
+              <w:rPr>
+                <w:sz w:val="17"/>
+              </w:rPr>
+              <w:t>frontend/src/component/admin/AppointmentTable.jsx</w:t>
+            </w:r>
+          </w:p>
+        </w:tc>
+        <w:tc>
+          <w:tcPr>
+            <w:tcW w:type="dxa" w:w="3888"/>
+            <w:shd w:fill="FFFFFF"/>
+            <w:tcMar>
+              <w:top w:w="70" w:type="dxa"/>
+              <w:bottom w:w="70" w:type="dxa"/>
+              <w:left w:w="80" w:type="dxa"/>
+              <w:right w:w="80" w:type="dxa"/>
+            </w:tcMar>
+            <w:tcBorders>
+              <w:top w:val="single" w:sz="4" w:space="0" w:color="E2E8F0"/>
+              <w:left w:val="single" w:sz="4" w:space="0" w:color="E2E8F0"/>
+              <w:bottom w:val="single" w:sz="4" w:space="0" w:color="E2E8F0"/>
+              <w:right w:val="single" w:sz="4" w:space="0" w:color="E2E8F0"/>
+            </w:tcBorders>
+          </w:tcPr>
+          <w:p>
+            <w:r>
+              <w:rPr>
+                <w:sz w:val="17"/>
+              </w:rPr>
+              <w:t>Quản lý danh sách lịch khám toàn viện kèm dropdown cập nhật trạng thái trực tiếp.</w:t>
+            </w:r>
+          </w:p>
+        </w:tc>
+      </w:tr>
+      <w:tr>
+        <w:tc>
+          <w:tcPr>
+            <w:tcW w:type="dxa" w:w="2592"/>
+            <w:shd w:fill="F8FAFC"/>
+            <w:tcMar>
+              <w:top w:w="70" w:type="dxa"/>
+              <w:bottom w:w="70" w:type="dxa"/>
+              <w:left w:w="80" w:type="dxa"/>
+              <w:right w:w="80" w:type="dxa"/>
+            </w:tcMar>
+            <w:tcBorders>
+              <w:top w:val="single" w:sz="4" w:space="0" w:color="E2E8F0"/>
+              <w:left w:val="single" w:sz="4" w:space="0" w:color="E2E8F0"/>
+              <w:bottom w:val="single" w:sz="4" w:space="0" w:color="E2E8F0"/>
+              <w:right w:val="single" w:sz="4" w:space="0" w:color="E2E8F0"/>
+            </w:tcBorders>
+          </w:tcPr>
+          <w:p>
+            <w:r>
+              <w:rPr>
+                <w:b/>
+                <w:sz w:val="17"/>
+              </w:rPr>
+              <w:t>Bảng Danh Bạ Bệnh Nhân</w:t>
+            </w:r>
+          </w:p>
+        </w:tc>
+        <w:tc>
+          <w:tcPr>
+            <w:tcW w:type="dxa" w:w="3168"/>
+            <w:shd w:fill="F8FAFC"/>
+            <w:tcMar>
+              <w:top w:w="70" w:type="dxa"/>
+              <w:bottom w:w="70" w:type="dxa"/>
+              <w:left w:w="80" w:type="dxa"/>
+              <w:right w:w="80" w:type="dxa"/>
+            </w:tcMar>
+            <w:tcBorders>
+              <w:top w:val="single" w:sz="4" w:space="0" w:color="E2E8F0"/>
+              <w:left w:val="single" w:sz="4" w:space="0" w:color="E2E8F0"/>
+              <w:bottom w:val="single" w:sz="4" w:space="0" w:color="E2E8F0"/>
+              <w:right w:val="single" w:sz="4" w:space="0" w:color="E2E8F0"/>
+            </w:tcBorders>
+          </w:tcPr>
+          <w:p>
+            <w:r>
+              <w:rPr>
+                <w:sz w:val="17"/>
+              </w:rPr>
+              <w:t>frontend/src/component/admin/PatientTable.jsx</w:t>
+            </w:r>
+          </w:p>
+        </w:tc>
+        <w:tc>
+          <w:tcPr>
+            <w:tcW w:type="dxa" w:w="3888"/>
+            <w:shd w:fill="F8FAFC"/>
+            <w:tcMar>
+              <w:top w:w="70" w:type="dxa"/>
+              <w:bottom w:w="70" w:type="dxa"/>
+              <w:left w:w="80" w:type="dxa"/>
+              <w:right w:w="80" w:type="dxa"/>
+            </w:tcMar>
+            <w:tcBorders>
+              <w:top w:val="single" w:sz="4" w:space="0" w:color="E2E8F0"/>
+              <w:left w:val="single" w:sz="4" w:space="0" w:color="E2E8F0"/>
+              <w:bottom w:val="single" w:sz="4" w:space="0" w:color="E2E8F0"/>
+              <w:right w:val="single" w:sz="4" w:space="0" w:color="E2E8F0"/>
+            </w:tcBorders>
+          </w:tcPr>
+          <w:p>
+            <w:r>
+              <w:rPr>
+                <w:sz w:val="17"/>
+              </w:rPr>
+              <w:t>Hiển thị hồ sơ bệnh nhân, mã định danh, avatar ký tự đầu và chức năng xóa hồ sơ.</w:t>
+            </w:r>
+          </w:p>
+        </w:tc>
+      </w:tr>
+    </w:tbl>
     <w:sectPr>
       <w:pgSz w:w="12240" w:h="15840"/>
       <w:pgMar w:top="1152" w:right="1296" w:bottom="1152" w:left="1296" w:header="720" w:footer="720" w:gutter="0"/>

</xml_diff>